<commit_message>
feat: update documents, responsive left sidebar layout, archive past events tab, and active equipment metrics
</commit_message>
<xml_diff>
--- a/OUTPUT/Mau_van_ban_test_ND30.docx
+++ b/OUTPUT/Mau_van_ban_test_ND30.docx
@@ -1200,15 +1200,16 @@
   <w:docDefaults>
     <w:rPrDefault>
       <w:rPr>
-        <w:rFonts w:asciiTheme="minorHAnsi" w:eastAsiaTheme="minorEastAsia" w:hAnsiTheme="minorHAnsi" w:cstheme="minorBidi"/>
-        <w:sz w:val="22"/>
-        <w:szCs w:val="22"/>
-        <w:lang w:val="en-US" w:eastAsia="en-US" w:bidi="ar-SA"/>
+        <w:rFonts w:ascii="Times New Roman" w:eastAsia="Times New Roman" w:hAnsi="Times New Roman" w:cs="Times New Roman"/>
+        <w:sz w:val="26"/>
+        <w:szCs w:val="26"/>
+        <w:color w:val="000000"/>
+        <w:lang w:val="vi-VN"/>
       </w:rPr>
     </w:rPrDefault>
     <w:pPrDefault>
       <w:pPr>
-        <w:spacing w:after="200" w:line="276" w:lineRule="auto"/>
+        <w:spacing w:before="0" w:after="80" w:line="276" w:lineRule="auto"/>
       </w:pPr>
     </w:pPrDefault>
   </w:docDefaults>

</xml_diff>